<commit_message>
ST:lab6 modified. Lab7 done(some tests fail but still:) )
</commit_message>
<xml_diff>
--- a/ST/Reports/Lab_5/Pairwice_testing.docx
+++ b/ST/Reports/Lab_5/Pairwice_testing.docx
@@ -3791,61 +3791,101 @@
         <w:tc>
           <w:tcPr>
             <w:tcW w:w="458" w:type="dxa"/>
-          </w:tcPr>
-          <w:p>
-            <w:pPr>
-              <w:rPr>
-                <w:rFonts w:ascii="Times New Roman" w:eastAsia="Times New Roman" w:hAnsi="Times New Roman" w:cs="Times New Roman"/>
-                <w:sz w:val="28"/>
-                <w:szCs w:val="28"/>
-                <w:lang w:eastAsia="ru-RU"/>
-              </w:rPr>
-            </w:pPr>
+            <w:hideMark/>
+          </w:tcPr>
+          <w:p>
+            <w:pPr>
+              <w:rPr>
+                <w:rFonts w:ascii="Times New Roman" w:eastAsia="Times New Roman" w:hAnsi="Times New Roman" w:cs="Times New Roman"/>
+                <w:sz w:val="28"/>
+                <w:szCs w:val="28"/>
+                <w:lang w:eastAsia="ru-RU"/>
+              </w:rPr>
+            </w:pPr>
+            <w:r>
+              <w:rPr>
+                <w:rFonts w:ascii="Times New Roman" w:eastAsia="Times New Roman" w:hAnsi="Times New Roman" w:cs="Times New Roman"/>
+                <w:sz w:val="28"/>
+                <w:szCs w:val="28"/>
+                <w:lang w:eastAsia="ru-RU"/>
+              </w:rPr>
+              <w:t>3</w:t>
+            </w:r>
           </w:p>
         </w:tc>
         <w:tc>
           <w:tcPr>
             <w:tcW w:w="2213" w:type="dxa"/>
-          </w:tcPr>
-          <w:p>
-            <w:pPr>
-              <w:rPr>
-                <w:rFonts w:ascii="Times New Roman" w:eastAsia="Times New Roman" w:hAnsi="Times New Roman" w:cs="Times New Roman"/>
-                <w:sz w:val="28"/>
-                <w:szCs w:val="28"/>
-                <w:lang w:eastAsia="ru-RU"/>
-              </w:rPr>
-            </w:pPr>
+            <w:hideMark/>
+          </w:tcPr>
+          <w:p>
+            <w:pPr>
+              <w:rPr>
+                <w:rFonts w:ascii="Times New Roman" w:eastAsia="Times New Roman" w:hAnsi="Times New Roman" w:cs="Times New Roman"/>
+                <w:sz w:val="28"/>
+                <w:szCs w:val="28"/>
+                <w:lang w:eastAsia="ru-RU"/>
+              </w:rPr>
+            </w:pPr>
+            <w:r>
+              <w:rPr>
+                <w:rFonts w:ascii="Times New Roman" w:eastAsia="Times New Roman" w:hAnsi="Times New Roman" w:cs="Times New Roman"/>
+                <w:sz w:val="28"/>
+                <w:szCs w:val="28"/>
+                <w:lang w:eastAsia="ru-RU"/>
+              </w:rPr>
+              <w:t>Автобус</w:t>
+            </w:r>
           </w:p>
         </w:tc>
         <w:tc>
           <w:tcPr>
             <w:tcW w:w="3561" w:type="dxa"/>
-          </w:tcPr>
-          <w:p>
-            <w:pPr>
-              <w:rPr>
-                <w:rFonts w:ascii="Times New Roman" w:eastAsia="Times New Roman" w:hAnsi="Times New Roman" w:cs="Times New Roman"/>
-                <w:sz w:val="28"/>
-                <w:szCs w:val="28"/>
-                <w:lang w:eastAsia="ru-RU"/>
-              </w:rPr>
-            </w:pPr>
+            <w:hideMark/>
+          </w:tcPr>
+          <w:p>
+            <w:pPr>
+              <w:rPr>
+                <w:rFonts w:ascii="Times New Roman" w:eastAsia="Times New Roman" w:hAnsi="Times New Roman" w:cs="Times New Roman"/>
+                <w:sz w:val="28"/>
+                <w:szCs w:val="28"/>
+                <w:lang w:eastAsia="ru-RU"/>
+              </w:rPr>
+            </w:pPr>
+            <w:r>
+              <w:rPr>
+                <w:rFonts w:ascii="Times New Roman" w:eastAsia="Times New Roman" w:hAnsi="Times New Roman" w:cs="Times New Roman"/>
+                <w:sz w:val="28"/>
+                <w:szCs w:val="28"/>
+                <w:lang w:eastAsia="ru-RU"/>
+              </w:rPr>
+              <w:t>Декада</w:t>
+            </w:r>
           </w:p>
         </w:tc>
         <w:tc>
           <w:tcPr>
             <w:tcW w:w="3261" w:type="dxa"/>
-          </w:tcPr>
-          <w:p>
-            <w:pPr>
-              <w:rPr>
-                <w:rFonts w:ascii="Times New Roman" w:eastAsia="Times New Roman" w:hAnsi="Times New Roman" w:cs="Times New Roman"/>
-                <w:sz w:val="28"/>
-                <w:szCs w:val="28"/>
-                <w:lang w:eastAsia="ru-RU"/>
-              </w:rPr>
-            </w:pPr>
+            <w:hideMark/>
+          </w:tcPr>
+          <w:p>
+            <w:pPr>
+              <w:rPr>
+                <w:rFonts w:ascii="Times New Roman" w:eastAsia="Times New Roman" w:hAnsi="Times New Roman" w:cs="Times New Roman"/>
+                <w:sz w:val="28"/>
+                <w:szCs w:val="28"/>
+                <w:lang w:eastAsia="ru-RU"/>
+              </w:rPr>
+            </w:pPr>
+            <w:r>
+              <w:rPr>
+                <w:rFonts w:ascii="Times New Roman" w:eastAsia="Times New Roman" w:hAnsi="Times New Roman" w:cs="Times New Roman"/>
+                <w:sz w:val="28"/>
+                <w:szCs w:val="28"/>
+                <w:lang w:eastAsia="ru-RU"/>
+              </w:rPr>
+              <w:t>Картой</w:t>
+            </w:r>
           </w:p>
         </w:tc>
       </w:tr>
@@ -3871,7 +3911,7 @@
                 <w:szCs w:val="28"/>
                 <w:lang w:eastAsia="ru-RU"/>
               </w:rPr>
-              <w:t>3</w:t>
+              <w:t>4</w:t>
             </w:r>
           </w:p>
         </w:tc>
@@ -3896,7 +3936,7 @@
                 <w:szCs w:val="28"/>
                 <w:lang w:eastAsia="ru-RU"/>
               </w:rPr>
-              <w:t>Троллейбус</w:t>
+              <w:t>Автобус</w:t>
             </w:r>
           </w:p>
         </w:tc>
@@ -3921,7 +3961,7 @@
                 <w:szCs w:val="28"/>
                 <w:lang w:eastAsia="ru-RU"/>
               </w:rPr>
-              <w:t>День</w:t>
+              <w:t>Месяц</w:t>
             </w:r>
           </w:p>
         </w:tc>
@@ -3974,7 +4014,7 @@
                 <w:lang w:eastAsia="ru-RU"/>
               </w:rPr>
               <w:lastRenderedPageBreak/>
-              <w:t>4</w:t>
+              <w:t>5</w:t>
             </w:r>
           </w:p>
         </w:tc>
@@ -4024,7 +4064,7 @@
                 <w:szCs w:val="28"/>
                 <w:lang w:eastAsia="ru-RU"/>
               </w:rPr>
-              <w:t>Месяц</w:t>
+              <w:t>День</w:t>
             </w:r>
           </w:p>
         </w:tc>
@@ -4049,7 +4089,7 @@
                 <w:szCs w:val="28"/>
                 <w:lang w:eastAsia="ru-RU"/>
               </w:rPr>
-              <w:t>Картой</w:t>
+              <w:t>Наличными</w:t>
             </w:r>
           </w:p>
         </w:tc>
@@ -4058,61 +4098,101 @@
         <w:tc>
           <w:tcPr>
             <w:tcW w:w="458" w:type="dxa"/>
-          </w:tcPr>
-          <w:p>
-            <w:pPr>
-              <w:rPr>
-                <w:rFonts w:ascii="Times New Roman" w:eastAsia="Times New Roman" w:hAnsi="Times New Roman" w:cs="Times New Roman"/>
-                <w:sz w:val="28"/>
-                <w:szCs w:val="28"/>
-                <w:lang w:eastAsia="ru-RU"/>
-              </w:rPr>
-            </w:pPr>
+            <w:hideMark/>
+          </w:tcPr>
+          <w:p>
+            <w:pPr>
+              <w:rPr>
+                <w:rFonts w:ascii="Times New Roman" w:eastAsia="Times New Roman" w:hAnsi="Times New Roman" w:cs="Times New Roman"/>
+                <w:sz w:val="28"/>
+                <w:szCs w:val="28"/>
+                <w:lang w:eastAsia="ru-RU"/>
+              </w:rPr>
+            </w:pPr>
+            <w:r>
+              <w:rPr>
+                <w:rFonts w:ascii="Times New Roman" w:eastAsia="Times New Roman" w:hAnsi="Times New Roman" w:cs="Times New Roman"/>
+                <w:sz w:val="28"/>
+                <w:szCs w:val="28"/>
+                <w:lang w:eastAsia="ru-RU"/>
+              </w:rPr>
+              <w:t>6</w:t>
+            </w:r>
           </w:p>
         </w:tc>
         <w:tc>
           <w:tcPr>
             <w:tcW w:w="2213" w:type="dxa"/>
-          </w:tcPr>
-          <w:p>
-            <w:pPr>
-              <w:rPr>
-                <w:rFonts w:ascii="Times New Roman" w:eastAsia="Times New Roman" w:hAnsi="Times New Roman" w:cs="Times New Roman"/>
-                <w:sz w:val="28"/>
-                <w:szCs w:val="28"/>
-                <w:lang w:eastAsia="ru-RU"/>
-              </w:rPr>
-            </w:pPr>
+            <w:hideMark/>
+          </w:tcPr>
+          <w:p>
+            <w:pPr>
+              <w:rPr>
+                <w:rFonts w:ascii="Times New Roman" w:eastAsia="Times New Roman" w:hAnsi="Times New Roman" w:cs="Times New Roman"/>
+                <w:sz w:val="28"/>
+                <w:szCs w:val="28"/>
+                <w:lang w:eastAsia="ru-RU"/>
+              </w:rPr>
+            </w:pPr>
+            <w:r>
+              <w:rPr>
+                <w:rFonts w:ascii="Times New Roman" w:eastAsia="Times New Roman" w:hAnsi="Times New Roman" w:cs="Times New Roman"/>
+                <w:sz w:val="28"/>
+                <w:szCs w:val="28"/>
+                <w:lang w:eastAsia="ru-RU"/>
+              </w:rPr>
+              <w:t>Троллейбус</w:t>
+            </w:r>
           </w:p>
         </w:tc>
         <w:tc>
           <w:tcPr>
             <w:tcW w:w="3561" w:type="dxa"/>
-          </w:tcPr>
-          <w:p>
-            <w:pPr>
-              <w:rPr>
-                <w:rFonts w:ascii="Times New Roman" w:eastAsia="Times New Roman" w:hAnsi="Times New Roman" w:cs="Times New Roman"/>
-                <w:sz w:val="28"/>
-                <w:szCs w:val="28"/>
-                <w:lang w:eastAsia="ru-RU"/>
-              </w:rPr>
-            </w:pPr>
+            <w:hideMark/>
+          </w:tcPr>
+          <w:p>
+            <w:pPr>
+              <w:rPr>
+                <w:rFonts w:ascii="Times New Roman" w:eastAsia="Times New Roman" w:hAnsi="Times New Roman" w:cs="Times New Roman"/>
+                <w:sz w:val="28"/>
+                <w:szCs w:val="28"/>
+                <w:lang w:eastAsia="ru-RU"/>
+              </w:rPr>
+            </w:pPr>
+            <w:r>
+              <w:rPr>
+                <w:rFonts w:ascii="Times New Roman" w:eastAsia="Times New Roman" w:hAnsi="Times New Roman" w:cs="Times New Roman"/>
+                <w:sz w:val="28"/>
+                <w:szCs w:val="28"/>
+                <w:lang w:eastAsia="ru-RU"/>
+              </w:rPr>
+              <w:t>Неделя</w:t>
+            </w:r>
           </w:p>
         </w:tc>
         <w:tc>
           <w:tcPr>
             <w:tcW w:w="3261" w:type="dxa"/>
-          </w:tcPr>
-          <w:p>
-            <w:pPr>
-              <w:rPr>
-                <w:rFonts w:ascii="Times New Roman" w:eastAsia="Times New Roman" w:hAnsi="Times New Roman" w:cs="Times New Roman"/>
-                <w:sz w:val="28"/>
-                <w:szCs w:val="28"/>
-                <w:lang w:eastAsia="ru-RU"/>
-              </w:rPr>
-            </w:pPr>
+            <w:hideMark/>
+          </w:tcPr>
+          <w:p>
+            <w:pPr>
+              <w:rPr>
+                <w:rFonts w:ascii="Times New Roman" w:eastAsia="Times New Roman" w:hAnsi="Times New Roman" w:cs="Times New Roman"/>
+                <w:sz w:val="28"/>
+                <w:szCs w:val="28"/>
+                <w:lang w:eastAsia="ru-RU"/>
+              </w:rPr>
+            </w:pPr>
+            <w:r>
+              <w:rPr>
+                <w:rFonts w:ascii="Times New Roman" w:eastAsia="Times New Roman" w:hAnsi="Times New Roman" w:cs="Times New Roman"/>
+                <w:sz w:val="28"/>
+                <w:szCs w:val="28"/>
+                <w:lang w:eastAsia="ru-RU"/>
+              </w:rPr>
+              <w:t>Картой</w:t>
+            </w:r>
           </w:p>
         </w:tc>
       </w:tr>
@@ -4138,7 +4218,7 @@
                 <w:szCs w:val="28"/>
                 <w:lang w:eastAsia="ru-RU"/>
               </w:rPr>
-              <w:t>5</w:t>
+              <w:t>7</w:t>
             </w:r>
           </w:p>
         </w:tc>
@@ -4163,7 +4243,7 @@
                 <w:szCs w:val="28"/>
                 <w:lang w:eastAsia="ru-RU"/>
               </w:rPr>
-              <w:t>Метро</w:t>
+              <w:t>Троллейбус</w:t>
             </w:r>
           </w:p>
         </w:tc>
@@ -4188,7 +4268,7 @@
                 <w:szCs w:val="28"/>
                 <w:lang w:eastAsia="ru-RU"/>
               </w:rPr>
-              <w:t>Неделя</w:t>
+              <w:t>Декада</w:t>
             </w:r>
           </w:p>
         </w:tc>
@@ -4213,7 +4293,7 @@
                 <w:szCs w:val="28"/>
                 <w:lang w:eastAsia="ru-RU"/>
               </w:rPr>
-              <w:t>Картой</w:t>
+              <w:t>Наличными</w:t>
             </w:r>
           </w:p>
         </w:tc>
@@ -4240,7 +4320,7 @@
                 <w:szCs w:val="28"/>
                 <w:lang w:eastAsia="ru-RU"/>
               </w:rPr>
-              <w:t>6</w:t>
+              <w:t>8</w:t>
             </w:r>
           </w:p>
         </w:tc>
@@ -4265,7 +4345,7 @@
                 <w:szCs w:val="28"/>
                 <w:lang w:eastAsia="ru-RU"/>
               </w:rPr>
-              <w:t>Метро</w:t>
+              <w:t>Троллейбус</w:t>
             </w:r>
           </w:p>
         </w:tc>
@@ -4290,7 +4370,7 @@
                 <w:szCs w:val="28"/>
                 <w:lang w:eastAsia="ru-RU"/>
               </w:rPr>
-              <w:t>Декада</w:t>
+              <w:t>Месяц</w:t>
             </w:r>
           </w:p>
         </w:tc>
@@ -4315,7 +4395,7 @@
                 <w:szCs w:val="28"/>
                 <w:lang w:eastAsia="ru-RU"/>
               </w:rPr>
-              <w:t>Наличными</w:t>
+              <w:t>Картой</w:t>
             </w:r>
           </w:p>
         </w:tc>
@@ -4324,61 +4404,101 @@
         <w:tc>
           <w:tcPr>
             <w:tcW w:w="458" w:type="dxa"/>
-          </w:tcPr>
-          <w:p>
-            <w:pPr>
-              <w:rPr>
-                <w:rFonts w:ascii="Times New Roman" w:eastAsia="Times New Roman" w:hAnsi="Times New Roman" w:cs="Times New Roman"/>
-                <w:sz w:val="28"/>
-                <w:szCs w:val="28"/>
-                <w:lang w:eastAsia="ru-RU"/>
-              </w:rPr>
-            </w:pPr>
+            <w:hideMark/>
+          </w:tcPr>
+          <w:p>
+            <w:pPr>
+              <w:rPr>
+                <w:rFonts w:ascii="Times New Roman" w:eastAsia="Times New Roman" w:hAnsi="Times New Roman" w:cs="Times New Roman"/>
+                <w:sz w:val="28"/>
+                <w:szCs w:val="28"/>
+                <w:lang w:eastAsia="ru-RU"/>
+              </w:rPr>
+            </w:pPr>
+            <w:r>
+              <w:rPr>
+                <w:rFonts w:ascii="Times New Roman" w:eastAsia="Times New Roman" w:hAnsi="Times New Roman" w:cs="Times New Roman"/>
+                <w:sz w:val="28"/>
+                <w:szCs w:val="28"/>
+                <w:lang w:eastAsia="ru-RU"/>
+              </w:rPr>
+              <w:t>9</w:t>
+            </w:r>
           </w:p>
         </w:tc>
         <w:tc>
           <w:tcPr>
             <w:tcW w:w="2213" w:type="dxa"/>
-          </w:tcPr>
-          <w:p>
-            <w:pPr>
-              <w:rPr>
-                <w:rFonts w:ascii="Times New Roman" w:eastAsia="Times New Roman" w:hAnsi="Times New Roman" w:cs="Times New Roman"/>
-                <w:sz w:val="28"/>
-                <w:szCs w:val="28"/>
-                <w:lang w:eastAsia="ru-RU"/>
-              </w:rPr>
-            </w:pPr>
+            <w:hideMark/>
+          </w:tcPr>
+          <w:p>
+            <w:pPr>
+              <w:rPr>
+                <w:rFonts w:ascii="Times New Roman" w:eastAsia="Times New Roman" w:hAnsi="Times New Roman" w:cs="Times New Roman"/>
+                <w:sz w:val="28"/>
+                <w:szCs w:val="28"/>
+                <w:lang w:eastAsia="ru-RU"/>
+              </w:rPr>
+            </w:pPr>
+            <w:r>
+              <w:rPr>
+                <w:rFonts w:ascii="Times New Roman" w:eastAsia="Times New Roman" w:hAnsi="Times New Roman" w:cs="Times New Roman"/>
+                <w:sz w:val="28"/>
+                <w:szCs w:val="28"/>
+                <w:lang w:eastAsia="ru-RU"/>
+              </w:rPr>
+              <w:t>Метро</w:t>
+            </w:r>
           </w:p>
         </w:tc>
         <w:tc>
           <w:tcPr>
             <w:tcW w:w="3561" w:type="dxa"/>
-          </w:tcPr>
-          <w:p>
-            <w:pPr>
-              <w:rPr>
-                <w:rFonts w:ascii="Times New Roman" w:eastAsia="Times New Roman" w:hAnsi="Times New Roman" w:cs="Times New Roman"/>
-                <w:sz w:val="28"/>
-                <w:szCs w:val="28"/>
-                <w:lang w:eastAsia="ru-RU"/>
-              </w:rPr>
-            </w:pPr>
+            <w:hideMark/>
+          </w:tcPr>
+          <w:p>
+            <w:pPr>
+              <w:rPr>
+                <w:rFonts w:ascii="Times New Roman" w:eastAsia="Times New Roman" w:hAnsi="Times New Roman" w:cs="Times New Roman"/>
+                <w:sz w:val="28"/>
+                <w:szCs w:val="28"/>
+                <w:lang w:eastAsia="ru-RU"/>
+              </w:rPr>
+            </w:pPr>
+            <w:r>
+              <w:rPr>
+                <w:rFonts w:ascii="Times New Roman" w:eastAsia="Times New Roman" w:hAnsi="Times New Roman" w:cs="Times New Roman"/>
+                <w:sz w:val="28"/>
+                <w:szCs w:val="28"/>
+                <w:lang w:eastAsia="ru-RU"/>
+              </w:rPr>
+              <w:t>День</w:t>
+            </w:r>
           </w:p>
         </w:tc>
         <w:tc>
           <w:tcPr>
             <w:tcW w:w="3261" w:type="dxa"/>
-          </w:tcPr>
-          <w:p>
-            <w:pPr>
-              <w:rPr>
-                <w:rFonts w:ascii="Times New Roman" w:eastAsia="Times New Roman" w:hAnsi="Times New Roman" w:cs="Times New Roman"/>
-                <w:sz w:val="28"/>
-                <w:szCs w:val="28"/>
-                <w:lang w:eastAsia="ru-RU"/>
-              </w:rPr>
-            </w:pPr>
+            <w:hideMark/>
+          </w:tcPr>
+          <w:p>
+            <w:pPr>
+              <w:rPr>
+                <w:rFonts w:ascii="Times New Roman" w:eastAsia="Times New Roman" w:hAnsi="Times New Roman" w:cs="Times New Roman"/>
+                <w:sz w:val="28"/>
+                <w:szCs w:val="28"/>
+                <w:lang w:eastAsia="ru-RU"/>
+              </w:rPr>
+            </w:pPr>
+            <w:r>
+              <w:rPr>
+                <w:rFonts w:ascii="Times New Roman" w:eastAsia="Times New Roman" w:hAnsi="Times New Roman" w:cs="Times New Roman"/>
+                <w:sz w:val="28"/>
+                <w:szCs w:val="28"/>
+                <w:lang w:eastAsia="ru-RU"/>
+              </w:rPr>
+              <w:t>Картой</w:t>
+            </w:r>
           </w:p>
         </w:tc>
       </w:tr>
@@ -4394,17 +4514,17 @@
                 <w:rFonts w:ascii="Times New Roman" w:eastAsia="Times New Roman" w:hAnsi="Times New Roman" w:cs="Times New Roman"/>
                 <w:sz w:val="28"/>
                 <w:szCs w:val="28"/>
-                <w:lang w:eastAsia="ru-RU"/>
-              </w:rPr>
-            </w:pPr>
-            <w:r>
-              <w:rPr>
-                <w:rFonts w:ascii="Times New Roman" w:eastAsia="Times New Roman" w:hAnsi="Times New Roman" w:cs="Times New Roman"/>
-                <w:sz w:val="28"/>
-                <w:szCs w:val="28"/>
-                <w:lang w:eastAsia="ru-RU"/>
-              </w:rPr>
-              <w:t>7</w:t>
+                <w:lang w:val="en-US" w:eastAsia="ru-RU"/>
+              </w:rPr>
+            </w:pPr>
+            <w:r>
+              <w:rPr>
+                <w:rFonts w:ascii="Times New Roman" w:eastAsia="Times New Roman" w:hAnsi="Times New Roman" w:cs="Times New Roman"/>
+                <w:sz w:val="28"/>
+                <w:szCs w:val="28"/>
+                <w:lang w:val="en-US" w:eastAsia="ru-RU"/>
+              </w:rPr>
+              <w:t>10</w:t>
             </w:r>
           </w:p>
         </w:tc>
@@ -4429,7 +4549,7 @@
                 <w:szCs w:val="28"/>
                 <w:lang w:eastAsia="ru-RU"/>
               </w:rPr>
-              <w:t>Трамвай</w:t>
+              <w:t>Метро</w:t>
             </w:r>
           </w:p>
         </w:tc>
@@ -4454,7 +4574,7 @@
                 <w:szCs w:val="28"/>
                 <w:lang w:eastAsia="ru-RU"/>
               </w:rPr>
-              <w:t>Декада</w:t>
+              <w:t>Неделя</w:t>
             </w:r>
           </w:p>
         </w:tc>
@@ -4479,7 +4599,7 @@
                 <w:szCs w:val="28"/>
                 <w:lang w:eastAsia="ru-RU"/>
               </w:rPr>
-              <w:t>Картой</w:t>
+              <w:t>Наличными</w:t>
             </w:r>
           </w:p>
         </w:tc>
@@ -4506,7 +4626,7 @@
                 <w:szCs w:val="28"/>
                 <w:lang w:eastAsia="ru-RU"/>
               </w:rPr>
-              <w:t>8</w:t>
+              <w:t>11</w:t>
             </w:r>
           </w:p>
         </w:tc>
@@ -4531,6 +4651,272 @@
                 <w:szCs w:val="28"/>
                 <w:lang w:eastAsia="ru-RU"/>
               </w:rPr>
+              <w:t>Метро</w:t>
+            </w:r>
+          </w:p>
+        </w:tc>
+        <w:tc>
+          <w:tcPr>
+            <w:tcW w:w="3561" w:type="dxa"/>
+            <w:hideMark/>
+          </w:tcPr>
+          <w:p>
+            <w:pPr>
+              <w:rPr>
+                <w:rFonts w:ascii="Times New Roman" w:eastAsia="Times New Roman" w:hAnsi="Times New Roman" w:cs="Times New Roman"/>
+                <w:sz w:val="28"/>
+                <w:szCs w:val="28"/>
+                <w:lang w:eastAsia="ru-RU"/>
+              </w:rPr>
+            </w:pPr>
+            <w:r>
+              <w:rPr>
+                <w:rFonts w:ascii="Times New Roman" w:eastAsia="Times New Roman" w:hAnsi="Times New Roman" w:cs="Times New Roman"/>
+                <w:sz w:val="28"/>
+                <w:szCs w:val="28"/>
+                <w:lang w:eastAsia="ru-RU"/>
+              </w:rPr>
+              <w:t>Декада</w:t>
+            </w:r>
+          </w:p>
+        </w:tc>
+        <w:tc>
+          <w:tcPr>
+            <w:tcW w:w="3261" w:type="dxa"/>
+            <w:hideMark/>
+          </w:tcPr>
+          <w:p>
+            <w:pPr>
+              <w:rPr>
+                <w:rFonts w:ascii="Times New Roman" w:eastAsia="Times New Roman" w:hAnsi="Times New Roman" w:cs="Times New Roman"/>
+                <w:sz w:val="28"/>
+                <w:szCs w:val="28"/>
+                <w:lang w:eastAsia="ru-RU"/>
+              </w:rPr>
+            </w:pPr>
+            <w:r>
+              <w:rPr>
+                <w:rFonts w:ascii="Times New Roman" w:eastAsia="Times New Roman" w:hAnsi="Times New Roman" w:cs="Times New Roman"/>
+                <w:sz w:val="28"/>
+                <w:szCs w:val="28"/>
+                <w:lang w:eastAsia="ru-RU"/>
+              </w:rPr>
+              <w:t>Картой</w:t>
+            </w:r>
+          </w:p>
+        </w:tc>
+      </w:tr>
+      <w:tr>
+        <w:tc>
+          <w:tcPr>
+            <w:tcW w:w="458" w:type="dxa"/>
+            <w:hideMark/>
+          </w:tcPr>
+          <w:p>
+            <w:pPr>
+              <w:rPr>
+                <w:rFonts w:ascii="Times New Roman" w:eastAsia="Times New Roman" w:hAnsi="Times New Roman" w:cs="Times New Roman"/>
+                <w:sz w:val="28"/>
+                <w:szCs w:val="28"/>
+                <w:lang w:eastAsia="ru-RU"/>
+              </w:rPr>
+            </w:pPr>
+            <w:r>
+              <w:rPr>
+                <w:rFonts w:ascii="Times New Roman" w:eastAsia="Times New Roman" w:hAnsi="Times New Roman" w:cs="Times New Roman"/>
+                <w:sz w:val="28"/>
+                <w:szCs w:val="28"/>
+                <w:lang w:eastAsia="ru-RU"/>
+              </w:rPr>
+              <w:t>12</w:t>
+            </w:r>
+          </w:p>
+        </w:tc>
+        <w:tc>
+          <w:tcPr>
+            <w:tcW w:w="2213" w:type="dxa"/>
+            <w:hideMark/>
+          </w:tcPr>
+          <w:p>
+            <w:pPr>
+              <w:rPr>
+                <w:rFonts w:ascii="Times New Roman" w:eastAsia="Times New Roman" w:hAnsi="Times New Roman" w:cs="Times New Roman"/>
+                <w:sz w:val="28"/>
+                <w:szCs w:val="28"/>
+                <w:lang w:eastAsia="ru-RU"/>
+              </w:rPr>
+            </w:pPr>
+            <w:r>
+              <w:rPr>
+                <w:rFonts w:ascii="Times New Roman" w:eastAsia="Times New Roman" w:hAnsi="Times New Roman" w:cs="Times New Roman"/>
+                <w:sz w:val="28"/>
+                <w:szCs w:val="28"/>
+                <w:lang w:eastAsia="ru-RU"/>
+              </w:rPr>
+              <w:t>Метро</w:t>
+            </w:r>
+          </w:p>
+        </w:tc>
+        <w:tc>
+          <w:tcPr>
+            <w:tcW w:w="3561" w:type="dxa"/>
+            <w:hideMark/>
+          </w:tcPr>
+          <w:p>
+            <w:pPr>
+              <w:rPr>
+                <w:rFonts w:ascii="Times New Roman" w:eastAsia="Times New Roman" w:hAnsi="Times New Roman" w:cs="Times New Roman"/>
+                <w:sz w:val="28"/>
+                <w:szCs w:val="28"/>
+                <w:lang w:eastAsia="ru-RU"/>
+              </w:rPr>
+            </w:pPr>
+            <w:r>
+              <w:rPr>
+                <w:rFonts w:ascii="Times New Roman" w:eastAsia="Times New Roman" w:hAnsi="Times New Roman" w:cs="Times New Roman"/>
+                <w:sz w:val="28"/>
+                <w:szCs w:val="28"/>
+                <w:lang w:eastAsia="ru-RU"/>
+              </w:rPr>
+              <w:t>Месяц</w:t>
+            </w:r>
+          </w:p>
+        </w:tc>
+        <w:tc>
+          <w:tcPr>
+            <w:tcW w:w="3261" w:type="dxa"/>
+            <w:hideMark/>
+          </w:tcPr>
+          <w:p>
+            <w:pPr>
+              <w:rPr>
+                <w:rFonts w:ascii="Times New Roman" w:eastAsia="Times New Roman" w:hAnsi="Times New Roman" w:cs="Times New Roman"/>
+                <w:sz w:val="28"/>
+                <w:szCs w:val="28"/>
+                <w:lang w:eastAsia="ru-RU"/>
+              </w:rPr>
+            </w:pPr>
+            <w:r>
+              <w:rPr>
+                <w:rFonts w:ascii="Times New Roman" w:eastAsia="Times New Roman" w:hAnsi="Times New Roman" w:cs="Times New Roman"/>
+                <w:sz w:val="28"/>
+                <w:szCs w:val="28"/>
+                <w:lang w:eastAsia="ru-RU"/>
+              </w:rPr>
+              <w:t>Наличными</w:t>
+            </w:r>
+          </w:p>
+        </w:tc>
+      </w:tr>
+      <w:tr>
+        <w:tc>
+          <w:tcPr>
+            <w:tcW w:w="458" w:type="dxa"/>
+          </w:tcPr>
+          <w:p>
+            <w:pPr>
+              <w:rPr>
+                <w:rFonts w:ascii="Times New Roman" w:eastAsia="Times New Roman" w:hAnsi="Times New Roman" w:cs="Times New Roman"/>
+                <w:sz w:val="28"/>
+                <w:szCs w:val="28"/>
+                <w:lang w:eastAsia="ru-RU"/>
+              </w:rPr>
+            </w:pPr>
+          </w:p>
+        </w:tc>
+        <w:tc>
+          <w:tcPr>
+            <w:tcW w:w="2213" w:type="dxa"/>
+          </w:tcPr>
+          <w:p>
+            <w:pPr>
+              <w:rPr>
+                <w:rFonts w:ascii="Times New Roman" w:eastAsia="Times New Roman" w:hAnsi="Times New Roman" w:cs="Times New Roman"/>
+                <w:sz w:val="28"/>
+                <w:szCs w:val="28"/>
+                <w:lang w:eastAsia="ru-RU"/>
+              </w:rPr>
+            </w:pPr>
+          </w:p>
+        </w:tc>
+        <w:tc>
+          <w:tcPr>
+            <w:tcW w:w="3561" w:type="dxa"/>
+          </w:tcPr>
+          <w:p>
+            <w:pPr>
+              <w:rPr>
+                <w:rFonts w:ascii="Times New Roman" w:eastAsia="Times New Roman" w:hAnsi="Times New Roman" w:cs="Times New Roman"/>
+                <w:sz w:val="28"/>
+                <w:szCs w:val="28"/>
+                <w:lang w:eastAsia="ru-RU"/>
+              </w:rPr>
+            </w:pPr>
+          </w:p>
+        </w:tc>
+        <w:tc>
+          <w:tcPr>
+            <w:tcW w:w="3261" w:type="dxa"/>
+          </w:tcPr>
+          <w:p>
+            <w:pPr>
+              <w:rPr>
+                <w:rFonts w:ascii="Times New Roman" w:eastAsia="Times New Roman" w:hAnsi="Times New Roman" w:cs="Times New Roman"/>
+                <w:sz w:val="28"/>
+                <w:szCs w:val="28"/>
+                <w:lang w:eastAsia="ru-RU"/>
+              </w:rPr>
+            </w:pPr>
+          </w:p>
+        </w:tc>
+      </w:tr>
+      <w:tr>
+        <w:tc>
+          <w:tcPr>
+            <w:tcW w:w="458" w:type="dxa"/>
+            <w:hideMark/>
+          </w:tcPr>
+          <w:p>
+            <w:pPr>
+              <w:rPr>
+                <w:rFonts w:ascii="Times New Roman" w:eastAsia="Times New Roman" w:hAnsi="Times New Roman" w:cs="Times New Roman"/>
+                <w:sz w:val="28"/>
+                <w:szCs w:val="28"/>
+                <w:lang w:eastAsia="ru-RU"/>
+              </w:rPr>
+            </w:pPr>
+            <w:r>
+              <w:rPr>
+                <w:rFonts w:ascii="Times New Roman" w:eastAsia="Times New Roman" w:hAnsi="Times New Roman" w:cs="Times New Roman"/>
+                <w:sz w:val="28"/>
+                <w:szCs w:val="28"/>
+                <w:lang w:eastAsia="ru-RU"/>
+              </w:rPr>
+              <w:t>13</w:t>
+            </w:r>
+          </w:p>
+        </w:tc>
+        <w:tc>
+          <w:tcPr>
+            <w:tcW w:w="2213" w:type="dxa"/>
+            <w:hideMark/>
+          </w:tcPr>
+          <w:p>
+            <w:pPr>
+              <w:rPr>
+                <w:rFonts w:ascii="Times New Roman" w:eastAsia="Times New Roman" w:hAnsi="Times New Roman" w:cs="Times New Roman"/>
+                <w:sz w:val="28"/>
+                <w:szCs w:val="28"/>
+                <w:lang w:eastAsia="ru-RU"/>
+              </w:rPr>
+            </w:pPr>
+            <w:r>
+              <w:rPr>
+                <w:rFonts w:ascii="Times New Roman" w:eastAsia="Times New Roman" w:hAnsi="Times New Roman" w:cs="Times New Roman"/>
+                <w:sz w:val="28"/>
+                <w:szCs w:val="28"/>
+                <w:lang w:eastAsia="ru-RU"/>
+              </w:rPr>
               <w:t>Трамвай</w:t>
             </w:r>
           </w:p>
@@ -4556,6 +4942,312 @@
                 <w:szCs w:val="28"/>
                 <w:lang w:eastAsia="ru-RU"/>
               </w:rPr>
+              <w:t>День</w:t>
+            </w:r>
+          </w:p>
+        </w:tc>
+        <w:tc>
+          <w:tcPr>
+            <w:tcW w:w="3261" w:type="dxa"/>
+            <w:hideMark/>
+          </w:tcPr>
+          <w:p>
+            <w:pPr>
+              <w:rPr>
+                <w:rFonts w:ascii="Times New Roman" w:eastAsia="Times New Roman" w:hAnsi="Times New Roman" w:cs="Times New Roman"/>
+                <w:sz w:val="28"/>
+                <w:szCs w:val="28"/>
+                <w:lang w:eastAsia="ru-RU"/>
+              </w:rPr>
+            </w:pPr>
+            <w:r>
+              <w:rPr>
+                <w:rFonts w:ascii="Times New Roman" w:eastAsia="Times New Roman" w:hAnsi="Times New Roman" w:cs="Times New Roman"/>
+                <w:sz w:val="28"/>
+                <w:szCs w:val="28"/>
+                <w:lang w:eastAsia="ru-RU"/>
+              </w:rPr>
+              <w:t>Наличными</w:t>
+            </w:r>
+          </w:p>
+        </w:tc>
+      </w:tr>
+      <w:tr>
+        <w:tc>
+          <w:tcPr>
+            <w:tcW w:w="458" w:type="dxa"/>
+            <w:hideMark/>
+          </w:tcPr>
+          <w:p>
+            <w:pPr>
+              <w:rPr>
+                <w:rFonts w:ascii="Times New Roman" w:eastAsia="Times New Roman" w:hAnsi="Times New Roman" w:cs="Times New Roman"/>
+                <w:sz w:val="28"/>
+                <w:szCs w:val="28"/>
+                <w:lang w:eastAsia="ru-RU"/>
+              </w:rPr>
+            </w:pPr>
+            <w:r>
+              <w:rPr>
+                <w:rFonts w:ascii="Times New Roman" w:eastAsia="Times New Roman" w:hAnsi="Times New Roman" w:cs="Times New Roman"/>
+                <w:sz w:val="28"/>
+                <w:szCs w:val="28"/>
+                <w:lang w:eastAsia="ru-RU"/>
+              </w:rPr>
+              <w:t>14</w:t>
+            </w:r>
+          </w:p>
+        </w:tc>
+        <w:tc>
+          <w:tcPr>
+            <w:tcW w:w="2213" w:type="dxa"/>
+            <w:hideMark/>
+          </w:tcPr>
+          <w:p>
+            <w:pPr>
+              <w:rPr>
+                <w:rFonts w:ascii="Times New Roman" w:eastAsia="Times New Roman" w:hAnsi="Times New Roman" w:cs="Times New Roman"/>
+                <w:sz w:val="28"/>
+                <w:szCs w:val="28"/>
+                <w:lang w:eastAsia="ru-RU"/>
+              </w:rPr>
+            </w:pPr>
+            <w:r>
+              <w:rPr>
+                <w:rFonts w:ascii="Times New Roman" w:eastAsia="Times New Roman" w:hAnsi="Times New Roman" w:cs="Times New Roman"/>
+                <w:sz w:val="28"/>
+                <w:szCs w:val="28"/>
+                <w:lang w:eastAsia="ru-RU"/>
+              </w:rPr>
+              <w:t>Трамвай</w:t>
+            </w:r>
+          </w:p>
+        </w:tc>
+        <w:tc>
+          <w:tcPr>
+            <w:tcW w:w="3561" w:type="dxa"/>
+            <w:hideMark/>
+          </w:tcPr>
+          <w:p>
+            <w:pPr>
+              <w:rPr>
+                <w:rFonts w:ascii="Times New Roman" w:eastAsia="Times New Roman" w:hAnsi="Times New Roman" w:cs="Times New Roman"/>
+                <w:sz w:val="28"/>
+                <w:szCs w:val="28"/>
+                <w:lang w:eastAsia="ru-RU"/>
+              </w:rPr>
+            </w:pPr>
+            <w:r>
+              <w:rPr>
+                <w:rFonts w:ascii="Times New Roman" w:eastAsia="Times New Roman" w:hAnsi="Times New Roman" w:cs="Times New Roman"/>
+                <w:sz w:val="28"/>
+                <w:szCs w:val="28"/>
+                <w:lang w:eastAsia="ru-RU"/>
+              </w:rPr>
+              <w:t>Неделя</w:t>
+            </w:r>
+          </w:p>
+        </w:tc>
+        <w:tc>
+          <w:tcPr>
+            <w:tcW w:w="3261" w:type="dxa"/>
+            <w:hideMark/>
+          </w:tcPr>
+          <w:p>
+            <w:pPr>
+              <w:rPr>
+                <w:rFonts w:ascii="Times New Roman" w:eastAsia="Times New Roman" w:hAnsi="Times New Roman" w:cs="Times New Roman"/>
+                <w:sz w:val="28"/>
+                <w:szCs w:val="28"/>
+                <w:lang w:eastAsia="ru-RU"/>
+              </w:rPr>
+            </w:pPr>
+            <w:r>
+              <w:rPr>
+                <w:rFonts w:ascii="Times New Roman" w:eastAsia="Times New Roman" w:hAnsi="Times New Roman" w:cs="Times New Roman"/>
+                <w:sz w:val="28"/>
+                <w:szCs w:val="28"/>
+                <w:lang w:eastAsia="ru-RU"/>
+              </w:rPr>
+              <w:t>Картой</w:t>
+            </w:r>
+          </w:p>
+        </w:tc>
+      </w:tr>
+      <w:tr>
+        <w:tc>
+          <w:tcPr>
+            <w:tcW w:w="458" w:type="dxa"/>
+            <w:hideMark/>
+          </w:tcPr>
+          <w:p>
+            <w:pPr>
+              <w:rPr>
+                <w:rFonts w:ascii="Times New Roman" w:eastAsia="Times New Roman" w:hAnsi="Times New Roman" w:cs="Times New Roman"/>
+                <w:sz w:val="28"/>
+                <w:szCs w:val="28"/>
+                <w:lang w:eastAsia="ru-RU"/>
+              </w:rPr>
+            </w:pPr>
+            <w:r>
+              <w:rPr>
+                <w:rFonts w:ascii="Times New Roman" w:eastAsia="Times New Roman" w:hAnsi="Times New Roman" w:cs="Times New Roman"/>
+                <w:sz w:val="28"/>
+                <w:szCs w:val="28"/>
+                <w:lang w:eastAsia="ru-RU"/>
+              </w:rPr>
+              <w:t>15</w:t>
+            </w:r>
+          </w:p>
+        </w:tc>
+        <w:tc>
+          <w:tcPr>
+            <w:tcW w:w="2213" w:type="dxa"/>
+            <w:hideMark/>
+          </w:tcPr>
+          <w:p>
+            <w:pPr>
+              <w:rPr>
+                <w:rFonts w:ascii="Times New Roman" w:eastAsia="Times New Roman" w:hAnsi="Times New Roman" w:cs="Times New Roman"/>
+                <w:sz w:val="28"/>
+                <w:szCs w:val="28"/>
+                <w:lang w:eastAsia="ru-RU"/>
+              </w:rPr>
+            </w:pPr>
+            <w:r>
+              <w:rPr>
+                <w:rFonts w:ascii="Times New Roman" w:eastAsia="Times New Roman" w:hAnsi="Times New Roman" w:cs="Times New Roman"/>
+                <w:sz w:val="28"/>
+                <w:szCs w:val="28"/>
+                <w:lang w:eastAsia="ru-RU"/>
+              </w:rPr>
+              <w:t>Трамвай</w:t>
+            </w:r>
+          </w:p>
+        </w:tc>
+        <w:tc>
+          <w:tcPr>
+            <w:tcW w:w="3561" w:type="dxa"/>
+            <w:hideMark/>
+          </w:tcPr>
+          <w:p>
+            <w:pPr>
+              <w:rPr>
+                <w:rFonts w:ascii="Times New Roman" w:eastAsia="Times New Roman" w:hAnsi="Times New Roman" w:cs="Times New Roman"/>
+                <w:sz w:val="28"/>
+                <w:szCs w:val="28"/>
+                <w:lang w:eastAsia="ru-RU"/>
+              </w:rPr>
+            </w:pPr>
+            <w:r>
+              <w:rPr>
+                <w:rFonts w:ascii="Times New Roman" w:eastAsia="Times New Roman" w:hAnsi="Times New Roman" w:cs="Times New Roman"/>
+                <w:sz w:val="28"/>
+                <w:szCs w:val="28"/>
+                <w:lang w:eastAsia="ru-RU"/>
+              </w:rPr>
+              <w:t>Декада</w:t>
+            </w:r>
+          </w:p>
+        </w:tc>
+        <w:tc>
+          <w:tcPr>
+            <w:tcW w:w="3261" w:type="dxa"/>
+            <w:hideMark/>
+          </w:tcPr>
+          <w:p>
+            <w:pPr>
+              <w:rPr>
+                <w:rFonts w:ascii="Times New Roman" w:eastAsia="Times New Roman" w:hAnsi="Times New Roman" w:cs="Times New Roman"/>
+                <w:sz w:val="28"/>
+                <w:szCs w:val="28"/>
+                <w:lang w:eastAsia="ru-RU"/>
+              </w:rPr>
+            </w:pPr>
+            <w:r>
+              <w:rPr>
+                <w:rFonts w:ascii="Times New Roman" w:eastAsia="Times New Roman" w:hAnsi="Times New Roman" w:cs="Times New Roman"/>
+                <w:sz w:val="28"/>
+                <w:szCs w:val="28"/>
+                <w:lang w:eastAsia="ru-RU"/>
+              </w:rPr>
+              <w:t>Наличными</w:t>
+            </w:r>
+          </w:p>
+        </w:tc>
+      </w:tr>
+      <w:tr>
+        <w:tc>
+          <w:tcPr>
+            <w:tcW w:w="458" w:type="dxa"/>
+            <w:hideMark/>
+          </w:tcPr>
+          <w:p>
+            <w:pPr>
+              <w:rPr>
+                <w:rFonts w:ascii="Times New Roman" w:eastAsia="Times New Roman" w:hAnsi="Times New Roman" w:cs="Times New Roman"/>
+                <w:sz w:val="28"/>
+                <w:szCs w:val="28"/>
+                <w:lang w:eastAsia="ru-RU"/>
+              </w:rPr>
+            </w:pPr>
+            <w:r>
+              <w:rPr>
+                <w:rFonts w:ascii="Times New Roman" w:eastAsia="Times New Roman" w:hAnsi="Times New Roman" w:cs="Times New Roman"/>
+                <w:sz w:val="28"/>
+                <w:szCs w:val="28"/>
+                <w:lang w:eastAsia="ru-RU"/>
+              </w:rPr>
+              <w:t>16</w:t>
+            </w:r>
+          </w:p>
+        </w:tc>
+        <w:tc>
+          <w:tcPr>
+            <w:tcW w:w="2213" w:type="dxa"/>
+            <w:hideMark/>
+          </w:tcPr>
+          <w:p>
+            <w:pPr>
+              <w:rPr>
+                <w:rFonts w:ascii="Times New Roman" w:eastAsia="Times New Roman" w:hAnsi="Times New Roman" w:cs="Times New Roman"/>
+                <w:sz w:val="28"/>
+                <w:szCs w:val="28"/>
+                <w:lang w:eastAsia="ru-RU"/>
+              </w:rPr>
+            </w:pPr>
+            <w:r>
+              <w:rPr>
+                <w:rFonts w:ascii="Times New Roman" w:eastAsia="Times New Roman" w:hAnsi="Times New Roman" w:cs="Times New Roman"/>
+                <w:sz w:val="28"/>
+                <w:szCs w:val="28"/>
+                <w:lang w:eastAsia="ru-RU"/>
+              </w:rPr>
+              <w:t>Трамвай</w:t>
+            </w:r>
+          </w:p>
+        </w:tc>
+        <w:tc>
+          <w:tcPr>
+            <w:tcW w:w="3561" w:type="dxa"/>
+            <w:hideMark/>
+          </w:tcPr>
+          <w:p>
+            <w:pPr>
+              <w:rPr>
+                <w:rFonts w:ascii="Times New Roman" w:eastAsia="Times New Roman" w:hAnsi="Times New Roman" w:cs="Times New Roman"/>
+                <w:sz w:val="28"/>
+                <w:szCs w:val="28"/>
+                <w:lang w:eastAsia="ru-RU"/>
+              </w:rPr>
+            </w:pPr>
+            <w:r>
+              <w:rPr>
+                <w:rFonts w:ascii="Times New Roman" w:eastAsia="Times New Roman" w:hAnsi="Times New Roman" w:cs="Times New Roman"/>
+                <w:sz w:val="28"/>
+                <w:szCs w:val="28"/>
+                <w:lang w:eastAsia="ru-RU"/>
+              </w:rPr>
               <w:t>Месяц</w:t>
             </w:r>
           </w:p>
@@ -4581,7 +5273,7 @@
                 <w:szCs w:val="28"/>
                 <w:lang w:eastAsia="ru-RU"/>
               </w:rPr>
-              <w:t>Наличными</w:t>
+              <w:t>Картой</w:t>
             </w:r>
           </w:p>
         </w:tc>

</xml_diff>